<commit_message>
Revise added manuscript passages into more natural academic prose
No change to figures or claims; rewrites the abstract, introduction,
Section 6 methods and results, and the added discussion text.

Co-Authored-By: Claude Sonnet 5.5 <noreply@anthropic.com>
Claude-Session: https://claude.ai/code/session_011RffuMUjsLZvDoxDjbpt5j
</commit_message>
<xml_diff>
--- a/pricing_forgetting/Pricing_Forgetting_Shapley-Based_Data_Valuation_for_Compensated_Unlearning_in_LLMs.docx
+++ b/pricing_forgetting/Pricing_Forgetting_Shapley-Based_Data_Valuation_for_Compensated_Unlearning_in_LLMs.docx
@@ -27,7 +27,7 @@
     <w:p>
       <w:pPr/>
       <w:r>
-        <w:t xml:space="preserve">Requests to remove data from trained language models are becoming routine, driven by privacy law, copyright disputes, and safety concerns. Yet two questions are usually treated separately: how much a piece of training data was worth, and what is lost when it is removed. We argue that these are the same question viewed from opposite ends, and that cooperative game theory gives a principled way to connect them. Modeling data contributors as players in a coalitional game, we show that the Shapley value of the contribution game coincides with the Shapley value of the corresponding deletion game, so a contributor's share of value created and their share of value destroyed by removal agree exactly. This duality motivates a compensation rule for unlearning that is consistent with ex ante data pricing. We then turn to a practical complication. Exact retraining is infeasible for large models, so the counterfactual utilities needed for Shapley estimation must themselves be produced by approximate unlearning. We show that residual knowledge left behind by approximate methods enters the estimated values additively, and that the aggregate bias is pinned down by a single quantity: the performance the model retains after every contributor has nominally been removed. Finally, we study the incentives of a model developer who is paid, or penalized, according to these values, and derive a simple audit condition under which reporting full unlearning is incentive compatible. We test these predictions in a small experiment on fictitious authors, with four contributor groups and exact retraining of every coalition. With gradient-ascent unlearning, the aggregate bias changes sign as unlearning strengthens, from a large understatement of total value to an overstatement, and individual biases do not vanish where the aggregate bias does. Sequential estimates depart from set-function estimates by an amount that grows with unlearning strength, and a brief relearning attack restores most of the removed knowledge even where the aggregate diagnostic suggests complete or excessive forgetting. The predictions on redundant contributors and on data that is hard to forget are not tested in this version.</w:t>
+        <w:t xml:space="preserve">Requests to remove data from trained language models are becoming routine, driven by privacy law, copyright disputes, and safety concerns. Yet two questions are usually treated separately: how much a piece of training data was worth, and what is lost when it is removed. We argue that these are the same question viewed from opposite ends, and that cooperative game theory gives a principled way to connect them. Modeling data contributors as players in a coalitional game, we show that the Shapley value of the contribution game coincides with the Shapley value of the corresponding deletion game, so a contributor's share of value created and their share of value destroyed by removal agree exactly. This duality motivates a compensation rule for unlearning that is consistent with ex ante data pricing. We then turn to a practical complication. Exact retraining is infeasible for large models, so the counterfactual utilities needed for Shapley estimation must themselves be produced by approximate unlearning. We show that residual knowledge left behind by approximate methods enters the estimated values additively, and that the aggregate bias is pinned down by a single quantity: the performance the model retains after every contributor has nominally been removed. Finally, we study the incentives of a model developer who is paid, or penalized, according to these values, and derive a simple audit condition under which reporting full unlearning is incentive compatible. We test these predictions in a small experiment on fictitious authors, with four contributor groups and exact retraining of every coalition. Under gradient-ascent unlearning, the aggregate bias changes sign as the method becomes more aggressive, moving from a large understatement of total value to an overstatement, and the biases on individual contributors remain where the aggregate bias is close to zero. Estimates built from sequential unlearning drift away from set-function estimates as unlearning strengthens, and a brief relearning attack restores most of the removed knowledge even when the aggregate diagnostic points to complete or excessive forgetting. Predictions concerning redundant contributors and data that is hard to forget are left untested in this version.</w:t>
       </w:r>
     </w:p>
     <w:p>
@@ -83,13 +83,13 @@
     <w:p>
       <w:pPr/>
       <w:r>
-        <w:t xml:space="preserve">We complement the theory with an empirical design. Benchmarks built around fictitious authors make it possible to define contributors cleanly and to know, by construction, what a model trained without a given author should and should not know. We describe how to estimate both true and unlearning-based Shapley values on small models where exact retraining is still feasible, and how to measure the residual game directly. We report a first experiment with four contributor groups and a 0.5B-parameter model, in which every coalition is retrained exactly. It tests the results on residual bias and order dependence and the audit-power channel (through a relearning attack), but not the predictions on redundant or heavily duplicated contributors, which we leave to future work.</w:t>
-      </w:r>
-    </w:p>
-    <w:p>
-      <w:pPr/>
-      <w:r>
-        <w:t xml:space="preserve">The rest of the paper is organized as follows. Section 2 reviews related work. Section 3 introduces the model and the duality result. Section 4 analyzes estimation under approximate unlearning. Section 5 studies incentives. Section 6 describes the experimental design and reports results. Section 7 discusses limitations, and Section 8 concludes.</w:t>
+        <w:t xml:space="preserve">We complement the theory with an empirical design. Benchmarks built around fictitious authors make it possible to define contributors cleanly and to know, by construction, what a model trained without a given author should and should not know. We describe how to estimate both true and unlearning-based Shapley values on small models where exact retraining is still feasible, and how to measure the residual game directly. We report a first experiment with four contributor groups and a 0.5B-parameter model in which every coalition is retrained exactly. It bears on the results about residual bias and order dependence and, through a relearning attack, on audit power. It does not address redundant or heavily duplicated contributors, which we leave for future work.</w:t>
+      </w:r>
+    </w:p>
+    <w:p>
+      <w:pPr/>
+      <w:r>
+        <w:t xml:space="preserve">The rest of the paper is organized as follows. Section 2 reviews related work. Section 3 introduces the model and the duality result. Section 4 analyzes estimation under approximate unlearning. Section 5 studies incentives. Section 6 describes the experimental design and reports the results. Section 7 discusses limitations, and Section 8 concludes.</w:t>
       </w:r>
     </w:p>
     <w:p>
@@ -453,7 +453,7 @@
     <w:p>
       <w:pPr/>
       <w:r>
-        <w:t xml:space="preserve">Proposition 2 also suggests a practical check. The aggregate bias does not require computing any Shapley values; it requires only one comparison between a fully unlearned model and a base model trained on D_0 alone. Developers often retain such base checkpoints. Where they do not, the comparison can be run on a smaller proxy model, which is the approach we take in Section 6. A large estimated ε(∅) is a warning that unlearning-based valuations should not be used for compensation without correction. A small or negative ε(∅) is not reassurance, however: it can coexist with substantial knowledge that a relearning attack recovers (Section 6.4).</w:t>
+        <w:t xml:space="preserve">Proposition 2 also suggests a practical check. The aggregate bias does not require computing any Shapley values; it requires only one comparison between a fully unlearned model and a base model trained on D_0 alone. Developers often retain such base checkpoints. Where they do not, the comparison can be run on a smaller proxy model, which is the approach we take in Section 6. A large estimated ε(∅) is a warning that unlearning-based valuations should not be used for compensation without correction. A small or negative ε(∅) is not reassuring, however, since it can coexist with substantial knowledge that a relearning attack recovers (Section 6.4).</w:t>
       </w:r>
     </w:p>
     <w:p>
@@ -579,7 +579,7 @@
     <w:p>
       <w:pPr/>
       <w:r>
-        <w:t xml:space="preserve">The theory makes four testable predictions. (P1) Leave-one-out values understate the contribution of redundant contributors relative to Shapley values. (P2) Shapley values estimated through approximate unlearning differ from retraining-based values by the Shapley value of a measurable residual game, with aggregate gap −ε(∅). (P3) Contributors whose data is harder to forget are undervalued more. (P4) Stronger recovery attacks raise measured residuals, and therefore audit power. The experiment reported below addresses P2 and P4; for P1 it provides only a sanity check on disjoint groups, and P3 is not tested.</w:t>
+        <w:t xml:space="preserve">The theory makes four testable predictions. (P1) Leave-one-out values understate the contribution of redundant contributors relative to Shapley values. (P2) Shapley values estimated through approximate unlearning differ from retraining-based values by the Shapley value of a measurable residual game, with aggregate gap −ε(∅). (P3) Contributors whose data is harder to forget are undervalued more. (P4) Stronger recovery attacks raise measured residuals, and therefore audit power. The experiment reported below speaks to P2 and P4. For P1 it offers only a sanity check on disjoint groups, and it does not test P3.</w:t>
       </w:r>
     </w:p>
     <w:p>
@@ -599,7 +599,7 @@
     <w:p>
       <w:pPr/>
       <w:r>
-        <w:t xml:space="preserve">We partition the authors into n = 4 contributor groups of ten authors each (twenty question-answer pairs per author). A base set D_0 of one hundred further authors is always included in training. With n = 4 there are 2^4 = 16 coalitions, so the contribution game can be computed exactly by fine-tuning one model per coalition. The base model is Qwen2.5-0.5B, fine-tuned in full for five epochs (AdamW, learning rate 2e-5, batch size 32) on D_0 together with the groups in the coalition, with one training run per coalition. Performance U(S) has two components. The author component is, for each group, the mean over its question-answer pairs of the exponentiated mean answer-token log-probability, averaged across the four groups. The general component is the same score on the TOFU real-authors and world-facts sets and captures collateral damage. The total game gives the two components equal weight, v = Δauthor + Δgeneral, where Δ is measured against U(∅). Both components are measured on the training questions themselves, so U measures memorization rather than generalization to paraphrased questions. We use this smooth score because its seed noise is low: the standard deviation of the author component across five retraining seeds is between 0.0004 and 0.0014 at the three coalitions we repeated (∅, {1, 2, 3}, and N).</w:t>
+        <w:t xml:space="preserve">We partition the authors into n = 4 contributor groups of ten authors each, with twenty question-answer pairs per author. A base corpus D_0 of one hundred further authors is always included in training. Because n = 4 yields only 2^4 = 16 coalitions, the contribution game can be computed exactly by fine-tuning one model per coalition. The base model is Qwen2.5-0.5B, which we fine-tune in full for five epochs (AdamW, learning rate 2e-5, batch size 32) on D_0 together with the groups in the coalition, using a single training run per coalition. Performance U(S) has two components. The author component scores each group by the mean, over its question-answer pairs, of the exponentiated mean answer-token log-probability, and averages this score across the four groups. The general component applies the same score to the TOFU real-authors and world-facts sets and serves to capture collateral damage. The two components receive equal weight, so that v = Δauthor + Δgeneral, with Δ measured relative to U(∅). Both components are evaluated on the training questions themselves, so U measures memorization rather than generalization to paraphrased questions. We adopt this smooth score because it has low seed noise. Across five retraining seeds, the standard deviation of the author component lies between 0.0004 and 0.0014 at the three coalitions we repeated (∅, {1, 2, 3}, and N).</w:t>
       </w:r>
     </w:p>
     <w:p>
@@ -613,7 +613,7 @@
     <w:p>
       <w:pPr/>
       <w:r>
-        <w:t xml:space="preserve">The design calls for two manipulations. To test P1, one constructs redundant contributors by giving two groups the same author facts; to test P3, one varies how deeply each group is learned by duplicating its training examples k times, for instance with k drawn from {1, 2, 4, 8}. Duplication is a natural proxy for the repetition that makes real web text hard to unlearn. Both manipulations are implemented, but the experiment reported here does not use them: the four groups are disjoint and each is trained once. P1 and P3 are therefore untested in this version.</w:t>
+        <w:t xml:space="preserve">The design calls for two manipulations. To test P1, redundant contributors are built by giving two groups the same author facts. To test P3, the depth to which each group is learned is varied by duplicating its training examples k times, for instance with k drawn from {1, 2, 4, 8}; duplication is a natural proxy for the repetition that makes real web text hard to unlearn. Both manipulations are implemented, but the experiment reported here uses neither: its four groups are disjoint, and each is trained once. P1 and P3 therefore remain untested.</w:t>
       </w:r>
     </w:p>
     <w:p>
@@ -663,7 +663,7 @@
         </w:numPr>
       </w:pPr>
       <w:r>
-        <w:t xml:space="preserve">unlearning-based Shapley values φ(v̂), computed in two ways: exactly from the table of Û(T) over all 16 coalitions, each obtained by unlearning N \ T from the fully trained model (the set-function estimate of Section 4.1), and by sequential unlearning along six random removal orders, crediting each group with the drop in author performance when it is removed (the sequential estimate). The unlearning algorithm A is gradient ascent on the negative log-likelihood of the forgotten question-answer pairs; gradient difference and Negative Preference Optimization (Zhang et al., 2024) are not yet run;</w:t>
+        <w:t xml:space="preserve">unlearning-based Shapley values φ(v̂), computed in two ways: exactly, from the table of Û(T) over all 16 coalitions, each entry obtained by unlearning N \ T from the fully trained model (the set-function estimate of Section 4.1); and sequentially, by unlearning groups one at a time along six random removal orders and crediting each group with the drop in author performance when it is removed (the sequential estimate). The unlearning algorithm A is gradient ascent on the negative log-likelihood of the forgotten question-answer pairs. Gradient difference and Negative Preference Optimization (Zhang et al., 2024) have not yet been run;</w:t>
       </w:r>
     </w:p>
     <w:p>
@@ -675,19 +675,19 @@
         </w:numPr>
       </w:pPr>
       <w:r>
-        <w:t xml:space="preserve">the residual function ε on all coalitions, obtained by comparing unlearned and retrained models, and its decomposition ε = ρ − κ into residual knowledge ρ (the average excess of unlearned over retrained performance on the forgotten groups) and collateral damage κ (the deficit on retained groups and on the general component).</w:t>
-      </w:r>
-    </w:p>
-    <w:p>
-      <w:pPr/>
-      <w:r>
-        <w:t xml:space="preserve">Unlearning starts from the model trained on all four groups and uses AdamW (learning rate 1e-6, batch size 16, gradient-norm clipping at 1.0). The strength s is the number of gradient-ascent steps per removed group, so removing |N \ T| groups takes s · |N \ T| steps. We chose the learning rate in a calibration run that tracks ε(∅) against s for learning rates 1e-5, 3e-6 and 1e-6. The sign of ε(∅) changes at about 2.9, 7.7 and 20.4 steps per group, respectively. At 1e-5 the transition is too abrupt to resolve on a grid of integer step counts, so we use 1e-6 and report s in {8, 12, 16, 20, 24, 32}, which brackets the sign change. The calibration uses the retrained baseline U(∅), that is, the diagnostic of Section 4.3, so we report all strengths rather than a single tuned one.</w:t>
-      </w:r>
-    </w:p>
-    <w:p>
-      <w:pPr/>
-      <w:r>
-        <w:t xml:space="preserve">To test P4, we re-measure residual knowledge after a relearning attack, in which the model from which all four groups have been unlearned is briefly fine-tuned (learning rate 2e-5, batch size 32) on a random 10 percent of the forgotten question-answer pairs and evaluated on the remaining 90 percent, following the protocol in Łucki et al. (2024). We report author performance at T = ∅ after zero and five relearning steps.</w:t>
+        <w:t xml:space="preserve">the residual function ε on all coalitions, obtained by comparing unlearned and retrained models, together with its decomposition ε = ρ − κ into residual knowledge ρ (the average excess of unlearned over retrained performance on the forgotten groups) and collateral damage κ (the deficit on the retained groups and on the general component).</w:t>
+      </w:r>
+    </w:p>
+    <w:p>
+      <w:pPr/>
+      <w:r>
+        <w:t xml:space="preserve">Unlearning starts from the model trained on all four groups and uses AdamW with a learning rate of 1e-6, a batch size of 16, and gradient-norm clipping at 1.0. The strength s is the number of gradient-ascent steps per removed group, so removing |N \ T| groups takes s · |N \ T| steps. We selected the learning rate in a calibration run that traces ε(∅) against s for learning rates of 1e-5, 3e-6, and 1e-6. The sign of ε(∅) changes at about 2.9, 7.7, and 20.4 steps per group, respectively. At 1e-5 the transition occurs too abruptly to be resolved on a grid of integer step counts, so we use 1e-6 and report s ∈ {8, 12, 16, 20, 24, 32}, a grid that brackets the sign change. Because the calibration relies on the retrained baseline U(∅), that is, on the diagnostic of Section 4.3, we report all strengths rather than a single tuned value.</w:t>
+      </w:r>
+    </w:p>
+    <w:p>
+      <w:pPr/>
+      <w:r>
+        <w:t xml:space="preserve">To test P4, we re-measure residual knowledge after a relearning attack. The model from which all four groups have been unlearned is briefly fine-tuned (learning rate 2e-5, batch size 32) on a random 10 percent of the forgotten question-answer pairs and evaluated on the remaining 90 percent, following the protocol of Łucki et al. (2024). We report author performance at T = ∅ after zero and five relearning steps.</w:t>
       </w:r>
     </w:p>
     <w:p>
@@ -701,7 +701,7 @@
     <w:p>
       <w:pPr/>
       <w:r>
-        <w:t xml:space="preserve">The two tables below summarize the outcomes. The first compares each prediction with what we observe. The second reports the residual game at the empty coalition, ε(∅) = ρ(∅) − κ(∅), for each unlearning strength, together with author performance at T = ∅ before and after a five-step relearning attack. For reference, the retrained baseline U(∅) has author performance 0.097.</w:t>
+        <w:t xml:space="preserve">The two tables below summarize the results. The first sets each prediction against what we observe. The second reports the residual game at the empty coalition, ε(∅) = ρ(∅) − κ(∅), for each unlearning strength, together with author performance at T = ∅ before and after a five-step relearning attack. The retrained baseline U(∅) has author performance 0.097.</w:t>
       </w:r>
     </w:p>
     <w:tbl>
@@ -811,7 +811,7 @@
           <w:p>
             <w:pPr/>
             <w:r>
-              <w:t xml:space="preserve">Not tested (no redundant groups). For the four disjoint groups, w({i}) / φ_i is between 0.99 and 1.00.</w:t>
+              <w:t xml:space="preserve">Not tested, as no groups are redundant. For the four disjoint groups, w({i}) / φ_i lies between 0.99 and 1.00.</w:t>
             </w:r>
           </w:p>
         </w:tc>
@@ -857,7 +857,7 @@
           <w:p>
             <w:pPr/>
             <w:r>
-              <w:t xml:space="preserve">Between −1.0 and −0.4 across strengths; uninformative, because the four groups are tied within seed noise.</w:t>
+              <w:t xml:space="preserve">Between −1.0 and −0.4 across strengths. Uninformative, since the four groups are tied within seed noise.</w:t>
             </w:r>
           </w:p>
         </w:tc>
@@ -903,7 +903,7 @@
           <w:p>
             <w:pPr/>
             <w:r>
-              <w:t xml:space="preserve">Holds by identity under exact enumeration. The gap −ε(∅) runs from −0.751 (s = 8) to +0.110 (s = 32).</w:t>
+              <w:t xml:space="preserve">Holds by identity under exact enumeration. The gap −ε(∅) ranges from −0.751 (s = 8) to +0.110 (s = 32).</w:t>
             </w:r>
           </w:p>
         </w:tc>
@@ -1427,13 +1427,63 @@
     <w:p>
       <w:pPr/>
       <w:r>
+        <w:t xml:space="preserve">Fine-tuning on all four groups yields v(N) = 0.846 on the author component and −0.003 on the general component, so the author data leaves general capability essentially unchanged. The exact Shapley values of the four groups are 0.211, 0.212, 0.212, and 0.211, which sum to v(N). The game is close to additive: the leave-one-out values (0.209 to 0.210) are within 1.3 percent of the Shapley values, as one would expect when no two groups are redundant. The differences among groups are of the same order as the retraining seed noise, which means that the ranking of contributors is not identified. This is a limitation of the symmetric design, and it renders rank correlations uninformative.</w:t>
+      </w:r>
+    </w:p>
+    <w:p>
+      <w:pPr/>
+      <w:r>
+        <w:t xml:space="preserve">Under exact enumeration of Û, the sum identity in Proposition 2 holds by construction, so the empirical question is how large ε(∅) is and which sign it takes. Both depend strongly on unlearning strength. At s = 8, ε(∅) is 0.751, almost all of it residual knowledge, and the estimated values sum to only 0.092, about 11 percent of the total contribution v(N) = 0.843. The sign changes between s = 16 and s = 20, at roughly 19 steps per group by linear interpolation. At s = 32, ε(∅) is −0.110 and the estimated values overstate the total by about 13 percent. Collateral damage stays small throughout (κ(∅) ≤ 0.013), so ε(∅) is close to ρ(∅) at every strength.</w:t>
+      </w:r>
+    </w:p>
+    <w:p>
+      <w:pPr/>
+      <w:r>
+        <w:t xml:space="preserve">A small aggregate bias does not imply small individual biases. The L1 norm of the Shapley values of the residual game, computed on the author component, falls from 0.748 at s = 8 to 0.078 at s = 20 and then rises to 0.110 at s = 32. At s = 20 the value of ρ(∅) is −0.043 while the L1 norm is 0.078, so the individual biases must have mixed signs and cannot be a common shift of all values. Even at its minimum, the L1 norm amounts to about 9 percent of v(N) on the author component.</w:t>
+      </w:r>
+    </w:p>
+    <w:p>
+      <w:pPr/>
+      <w:r>
+        <w:t xml:space="preserve">The sequential estimate moves away from the set-function estimate as strength increases. The L1 distance between the two is 0.017 at s = 8, 0.142 at s = 12, 0.175 at s = 16, 0.244 at s = 20, 0.253 at s = 24, and 0.272 at s = 32, against v(N) = 0.846 on the author component. The assumption of Section 4.1 thus holds approximately for weak unlearning but breaks down at the strengths where the aggregate bias is small. Because the sequential estimate averages over only six of the 24 possible removal orders, part of each distance reflects sampling error; the increase with strength is nevertheless monotone.</w:t>
+      </w:r>
+    </w:p>
+    <w:p>
+      <w:pPr/>
+      <w:r>
+        <w:t xml:space="preserve">The relearning attack shows that the aggregate diagnostic can mislead. Before the attack, author performance at ∅ is 0.844, 0.528, 0.236, 0.055, 0.002, and 0.000 for s = 8 to 32, against a retrained baseline of 0.097. After five relearning steps on 10 percent of the forgotten pairs, performance on the remaining 90 percent returns to 0.83, 0.83, 0.80, 0.78, and 0.74 for s up to 24, and to 0.24 for s = 32. At s = 20 and s = 24, where ε(∅) is negative and the diagnostic would suggest complete or even excessive forgetting, a brief attack therefore recovers most of the lost performance. This is consistent with P4: the measured residual depends on the strength of the attack, and a value of ε(∅) obtained without an attack does not certify removal. We did not apply the same attack to a model retrained without the groups, so we cannot separate residual knowledge from a general ability to relearn quickly from a few examples. Such a control is needed before the recovered performance can be read as residual knowledge alone.</w:t>
+      </w:r>
+    </w:p>
+    <w:p>
+      <w:pPr/>
+      <w:r>
+        <w:t xml:space="preserve">Taken together, the results support the claim that the aggregate bias is governed by ε(∅) and can take either sign, depending on how aggressively the method unlearns. They also show that individual biases and order dependence persist where the aggregate bias is small. They do not speak to redundancy (P1), to data that is hard to forget (P3), or to differences across unlearning methods.</w:t>
+      </w:r>
+    </w:p>
+    <w:p>
+      <w:pPr>
+        <w:pStyle w:val="Heading2"/>
+      </w:pPr>
+      <w:r>
+        <w:t xml:space="preserve">7 Discussion and Limitations</w:t>
+      </w:r>
+    </w:p>
+    <w:p>
+      <w:pPr/>
+      <w:r>
+        <w:t xml:space="preserve">Several assumptions deserve scrutiny.</w:t>
+      </w:r>
+    </w:p>
+    <w:p>
+      <w:pPr/>
+      <w:r>
         <w:rPr>
           <w:b/>
         </w:rPr>
-        <w:t xml:space="preserve">Retrained game.</w:t>
-      </w:r>
-      <w:r>
-        <w:t xml:space="preserve"> Fine-tuning on all four groups gives v(N) = 0.846 on the author component and −0.003 on the general component, so the author data leaves general capability essentially unchanged. The exact Shapley values of the four groups are 0.211, 0.212, 0.212 and 0.211, which sum to v(N). The game is close to additive: leave-one-out values (0.209 to 0.210) are within 1.3 percent of the Shapley values, as expected when no two groups are redundant. The differences among groups are of the same order as retraining seed noise, so the exact ranking of contributors is not identified. This is a limitation of the symmetric design, and it makes rank correlations uninformative.</w:t>
+        <w:t xml:space="preserve">Order independence.</w:t>
+      </w:r>
+      <w:r>
+        <w:t xml:space="preserve"> Proposition 2 treats Û as a set function. Sequential unlearning is likely to violate this, since each update starts from a model already perturbed by earlier ones. If path dependence is strong, the estimated game is no longer well defined, and one would need to average over removal orders or model the residual as a function of the path. We view this as the most important open technical question raised by the paper. In the experiment of Section 6, the L1 distance between the sequential and set-function estimates grows from 0.017 to 0.272 as unlearning strengthens, against v(N) = 0.846, so the assumption is not innocuous at the strengths where the aggregate bias is small.</w:t>
       </w:r>
     </w:p>
     <w:p>
@@ -1442,10 +1492,10 @@
         <w:rPr>
           <w:b/>
         </w:rPr>
-        <w:t xml:space="preserve">Aggregate bias (P2).</w:t>
-      </w:r>
-      <w:r>
-        <w:t xml:space="preserve"> Under exact enumeration of Û, the sum identity in Proposition 2 holds by construction, so the empirical content is the size and sign of ε(∅). It depends strongly on unlearning strength. At s = 8, ε(∅) = 0.751 and nearly all of it is residual knowledge: the estimated values sum to 0.092, about 11 percent of the total contribution v(N) = 0.843. The sign changes between s = 16 and s = 20 (about 19 steps per group by linear interpolation). At s = 32, ε(∅) = −0.110, and the estimated values overstate the total by about 13 percent. Collateral damage is small throughout (κ(∅) ≤ 0.013), so ε(∅) is close to ρ(∅) at every strength.</w:t>
+        <w:t xml:space="preserve">Choice of utility.</w:t>
+      </w:r>
+      <w:r>
+        <w:t xml:space="preserve"> Shapley values are only as meaningful as the performance measure behind them. A contributor's data may matter a great deal for some capabilities and not at all for others, and the weighting of evaluation tasks is a normative choice that our framework does not resolve. Collateral damage is particularly sensitive to it.</w:t>
       </w:r>
     </w:p>
     <w:p>
@@ -1454,10 +1504,10 @@
         <w:rPr>
           <w:b/>
         </w:rPr>
-        <w:t xml:space="preserve">Individual bias.</w:t>
-      </w:r>
-      <w:r>
-        <w:t xml:space="preserve"> Where the aggregate bias is smallest, individual biases are not. The L1 norm of the Shapley values of the residual game on the author component falls from 0.748 at s = 8 to 0.078 at s = 20 and rises to 0.110 at s = 32. At s = 20, ρ(∅) = −0.043 while the L1 norm is 0.078, so the individual biases have mixed signs and are not a common shift of all values. The minimum of 0.078 is about 9 percent of v(N) on the author component.</w:t>
+        <w:t xml:space="preserve">Scale.</w:t>
+      </w:r>
+      <w:r>
+        <w:t xml:space="preserve"> Our empirical design relies on small models and synthetic data, where exact retraining is cheap. Whether residual games at frontier scale resemble those at small scale is unknown. We expect the qualitative pattern, that data learned through heavy repetition leaves more residue, to carry over, but the magnitudes may not.</w:t>
       </w:r>
     </w:p>
     <w:p>
@@ -1466,96 +1516,10 @@
         <w:rPr>
           <w:b/>
         </w:rPr>
-        <w:t xml:space="preserve">Order dependence.</w:t>
-      </w:r>
-      <w:r>
-        <w:t xml:space="preserve"> The sequential estimate departs from the set-function estimate by an amount that grows with strength. The L1 distance between them is 0.017 at s = 8, 0.142 at 12, 0.175 at 16, 0.244 at 20, 0.253 at 24 and 0.272 at 32, against v(N) = 0.846 on the author component. The assumption of Section 4.1 therefore holds approximately for weak unlearning and fails at the strengths where aggregate bias is small. The sequential estimate averages over only six of the 24 removal orders, so part of each distance is sampling error, but the growth with strength is monotone.</w:t>
-      </w:r>
-    </w:p>
-    <w:p>
-      <w:pPr/>
-      <w:r>
-        <w:rPr>
-          <w:b/>
-        </w:rPr>
-        <w:t xml:space="preserve">Relearning (P4).</w:t>
-      </w:r>
-      <w:r>
-        <w:t xml:space="preserve"> After all four groups are unlearned, author performance at ∅ is 0.844, 0.528, 0.236, 0.055, 0.002 and 0.000 for s = 8 to 32, against a retrained baseline of 0.097. Five relearning steps on 10 percent of the forgotten pairs restore performance on the other 90 percent to 0.83, 0.83, 0.80, 0.78 and 0.74 for s up to 24, and to 0.24 for s = 32. At s = 20 and s = 24, where ε(∅) is negative and the aggregate diagnostic would suggest complete or excessive forgetting, a brief attack recovers most of the performance. The measured residual thus depends on the strength of the attack, as P4 predicts, and ε(∅) measured without an attack does not certify removal. We did not apply the same attack to a model retrained without the groups, so we cannot separate residual knowledge from the general ability to relearn quickly from a few examples. A retrained control is needed before the recovered performance is read as residual knowledge alone.</w:t>
-      </w:r>
-    </w:p>
-    <w:p>
-      <w:pPr/>
-      <w:r>
-        <w:rPr>
-          <w:b/>
-        </w:rPr>
-        <w:t xml:space="preserve">Summary.</w:t>
-      </w:r>
-      <w:r>
-        <w:t xml:space="preserve"> The experiment supports the claim that the aggregate bias is governed by ε(∅) and can take either sign, depending on how aggressively the method unlearns. It also shows that individual biases and order dependence persist where the aggregate bias is small. It does not test redundancy (P1), data that is hard to forget (P3), or differences across unlearning methods.</w:t>
-      </w:r>
-    </w:p>
-    <w:p>
-      <w:pPr>
-        <w:pStyle w:val="Heading2"/>
-      </w:pPr>
-      <w:r>
-        <w:t xml:space="preserve">7 Discussion and Limitations</w:t>
-      </w:r>
-    </w:p>
-    <w:p>
-      <w:pPr/>
-      <w:r>
-        <w:t xml:space="preserve">Several assumptions deserve scrutiny.</w:t>
-      </w:r>
-    </w:p>
-    <w:p>
-      <w:pPr/>
-      <w:r>
-        <w:rPr>
-          <w:b/>
-        </w:rPr>
-        <w:t xml:space="preserve">Order independence.</w:t>
-      </w:r>
-      <w:r>
-        <w:t xml:space="preserve"> Proposition 2 treats Û as a set function. Sequential unlearning is likely to violate this, since each update starts from a model already perturbed by earlier ones. If path dependence is strong, the estimated game is no longer well defined, and one would need to average over removal orders or model the residual as a function of the path. We view this as the most important open technical question raised by the paper. In the experiment of Section 6, the L1 distance between sequential and set-function estimates grows from 0.017 to 0.272 as unlearning strengthens, against v(N) = 0.846, so the assumption is not innocuous at the strengths where aggregate bias is small.</w:t>
-      </w:r>
-    </w:p>
-    <w:p>
-      <w:pPr/>
-      <w:r>
-        <w:rPr>
-          <w:b/>
-        </w:rPr>
-        <w:t xml:space="preserve">Choice of utility.</w:t>
-      </w:r>
-      <w:r>
-        <w:t xml:space="preserve"> Shapley values are only as meaningful as the performance measure behind them. A contributor's data may matter a great deal for some capabilities and not at all for others, and the weighting of evaluation tasks is a normative choice that our framework does not resolve. Collateral damage is particularly sensitive to it.</w:t>
-      </w:r>
-    </w:p>
-    <w:p>
-      <w:pPr/>
-      <w:r>
-        <w:rPr>
-          <w:b/>
-        </w:rPr>
-        <w:t xml:space="preserve">Scale.</w:t>
-      </w:r>
-      <w:r>
-        <w:t xml:space="preserve"> Our empirical design relies on small models and synthetic data, where exact retraining is cheap. Whether residual games at frontier scale resemble those at small scale is unknown. We expect the qualitative pattern, that data learned through heavy repetition leaves more residue, to carry over, but the magnitudes may not.</w:t>
-      </w:r>
-    </w:p>
-    <w:p>
-      <w:pPr/>
-      <w:r>
-        <w:rPr>
-          <w:b/>
-        </w:rPr>
         <w:t xml:space="preserve">Experimental scope.</w:t>
       </w:r>
       <w:r>
-        <w:t xml:space="preserve"> The experiment in Section 6 uses four disjoint and statistically symmetric contributor groups, one 0.5B-parameter model, one unlearning algorithm (gradient ascent), and a single training run per coalition. The symmetry leaves the ranking of contributors unidentified within seed noise, so we cannot say how well unlearning-based values preserve rankings. Redundancy (P1), data that is hard to forget (P3) and the comparison across unlearning methods are untested. The calibration of unlearning strength used the retrained baseline, and the relearning attack lacks a retrained control.</w:t>
+        <w:t xml:space="preserve"> The experiment in Section 6 uses four disjoint and statistically symmetric contributor groups, a single 0.5B-parameter model, one unlearning algorithm (gradient ascent), and one training run per coalition. Because of the symmetry, the ranking of contributors cannot be distinguished from seed noise, and we cannot say how well unlearning-based values preserve rankings. Redundancy (P1), data that is hard to forget (P3), and the comparison across unlearning methods remain untested. In addition, the calibration of unlearning strength used the retrained baseline, and the relearning attack lacks a retrained control.</w:t>
       </w:r>
     </w:p>
     <w:p>

</xml_diff>

<commit_message>
Polish prose throughout manuscript; allow signed rho and kappa in Section 4.1
Sentence-level edits to the abstract, introduction, related work, model,
incentives, and conclusion. Equations, propositions, proofs, and citations
are unchanged. Section 4.1 no longer calls rho and kappa non-negative,
matching the experiment, where rho(empty) is negative at strengths >= 20.

Co-Authored-By: Claude Sonnet 5.5 <noreply@anthropic.com>
Claude-Session: https://claude.ai/code/session_011RffuMUjsLZvDoxDjbpt5j
</commit_message>
<xml_diff>
--- a/pricing_forgetting/Pricing_Forgetting_Shapley-Based_Data_Valuation_for_Compensated_Unlearning_in_LLMs.docx
+++ b/pricing_forgetting/Pricing_Forgetting_Shapley-Based_Data_Valuation_for_Compensated_Unlearning_in_LLMs.docx
@@ -27,7 +27,7 @@
     <w:p>
       <w:pPr/>
       <w:r>
-        <w:t xml:space="preserve">Requests to remove data from trained language models are becoming routine, driven by privacy law, copyright disputes, and safety concerns. Yet two questions are usually treated separately: how much a piece of training data was worth, and what is lost when it is removed. We argue that these are the same question viewed from opposite ends, and that cooperative game theory gives a principled way to connect them. Modeling data contributors as players in a coalitional game, we show that the Shapley value of the contribution game coincides with the Shapley value of the corresponding deletion game, so a contributor's share of value created and their share of value destroyed by removal agree exactly. This duality motivates a compensation rule for unlearning that is consistent with ex ante data pricing. We then turn to a practical complication. Exact retraining is infeasible for large models, so the counterfactual utilities needed for Shapley estimation must themselves be produced by approximate unlearning. We show that residual knowledge left behind by approximate methods enters the estimated values additively, and that the aggregate bias is pinned down by a single quantity: the performance the model retains after every contributor has nominally been removed. Finally, we study the incentives of a model developer who is paid, or penalized, according to these values, and derive a simple audit condition under which reporting full unlearning is incentive compatible. We test these predictions in a small experiment on fictitious authors, with four contributor groups and exact retraining of every coalition. Under gradient-ascent unlearning, the aggregate bias changes sign as the method becomes more aggressive, moving from a large understatement of total value to an overstatement, and the biases on individual contributors remain where the aggregate bias is close to zero. Estimates built from sequential unlearning drift away from set-function estimates as unlearning strengthens, and a brief relearning attack restores most of the removed knowledge even when the aggregate diagnostic points to complete or excessive forgetting. Predictions concerning redundant contributors and data that is hard to forget are left untested in this version.</w:t>
+        <w:t xml:space="preserve">Requests to remove data from trained language models are increasingly routine, prompted by privacy law, copyright disputes, and safety concerns. Yet two questions that belong together are usually treated apart: what a piece of training data was worth, and what is lost when it is removed. We argue that these are one question seen from opposite ends, and that cooperative game theory provides a principled way to connect them. Treating data contributors as players in a coalitional game, we show that the Shapley value of the contribution game coincides with that of the corresponding deletion game, so that a contributor's share of the value created and their share of the value destroyed by removal agree exactly. This duality motivates a compensation rule for unlearning that is consistent with ex ante data pricing. We then address a practical complication. Because exact retraining is infeasible for large models, the counterfactual utilities needed for Shapley estimation must themselves come from approximate unlearning. We show that the residual knowledge left by approximate methods enters the estimated values additively, and that the aggregate bias is pinned down by a single quantity: the performance the model retains once every contributor has nominally been removed. Finally, we study the incentives of a developer who is paid, or penalized, according to these values, and derive a simple audit condition under which reporting full unlearning is incentive compatible. We test these predictions in a small experiment on fictitious authors, with four contributor groups and exact retraining of every coalition. Under gradient-ascent unlearning, the aggregate bias changes sign as the method becomes more aggressive, moving from a large understatement of total value to an overstatement, while biases on individual contributors persist where the aggregate bias is close to zero. Estimates built from sequential unlearning drift away from set-function estimates as unlearning strengthens, and a brief relearning attack restores most of the removed knowledge even when the aggregate diagnostic points to complete or excessive forgetting. Predictions concerning redundant contributors and data that is hard to forget are left untested in this version.</w:t>
       </w:r>
     </w:p>
     <w:p>
@@ -41,19 +41,19 @@
     <w:p>
       <w:pPr/>
       <w:r>
-        <w:t xml:space="preserve">A language model is, among other things, a lossy summary of the data it was trained on. When a data owner later asks for that data to be removed, the developer faces an awkward problem. Retraining from scratch is the only method that is guaranteed to work, and for frontier-scale models it is far too expensive to do on demand. The field of machine unlearning has responded with a large family of approximate methods, ranging from gradient ascent on the forget set to preference-style objectives that push the model away from memorized completions. These methods are cheap. Whether they actually remove anything is less clear, and a growing body of evidence suggests that much of what they "forget" can be recovered with modest effort.</w:t>
-      </w:r>
-    </w:p>
-    <w:p>
-      <w:pPr/>
-      <w:r>
-        <w:t xml:space="preserve">A parallel literature asks a different question: how much is a given piece of data worth to a model? Data Shapley and its descendants answer this by treating training examples, or groups of examples, as players in a cooperative game whose payoff is model performance. The Shapley value then distributes the total performance among players according to their average marginal contribution across all possible coalitions. This idea has found its way into proposals for data markets, revenue sharing with content creators, and the curation of training sets.</w:t>
-      </w:r>
-    </w:p>
-    <w:p>
-      <w:pPr/>
-      <w:r>
-        <w:t xml:space="preserve">The two literatures rarely speak to each other, which is surprising once one notices that they are built on the same object. Data valuation asks what happens to performance when data is added. Unlearning asks what happens when it is taken away. If a regulator or a court were to require that contributors be compensated for the use of their data, and also that they be able to withdraw it, one would want the two calculations to agree. A contributor who is paid a large share of value for joining should not find that removing them costs the developer almost nothing, and vice versa.</w:t>
+        <w:t xml:space="preserve">A language model is, among other things, a lossy summary of its training data. When a data owner later asks for that data to be removed, the developer faces an awkward problem. Retraining from scratch is the only method guaranteed to work, and for frontier-scale models it is far too expensive to perform on demand. Machine unlearning has responded with a large family of approximate methods, from gradient ascent on the forget set to preference-style objectives that push the model away from memorized completions. These methods are cheap, but whether they remove anything is less clear, and a growing body of evidence suggests that much of what they "forget" can be recovered with modest effort.</w:t>
+      </w:r>
+    </w:p>
+    <w:p>
+      <w:pPr/>
+      <w:r>
+        <w:t xml:space="preserve">A parallel literature asks a different question: how much is a given piece of data worth to a model? Data Shapley and its descendants treat training examples, or groups of examples, as players in a cooperative game whose payoff is model performance. The Shapley value then divides the total performance among the players according to their average marginal contribution over all possible coalitions. The idea has found its way into proposals for data markets, revenue sharing with content creators, and the curation of training sets.</w:t>
+      </w:r>
+    </w:p>
+    <w:p>
+      <w:pPr/>
+      <w:r>
+        <w:t xml:space="preserve">The two literatures rarely speak to each other, which is surprising given that they are built on the same object. Data valuation asks what happens to performance when data is added; unlearning asks what happens when it is taken away. If a regulator or a court required both that contributors be compensated for the use of their data and that they be able to withdraw it, one would want the two calculations to agree. A contributor who is paid a large share of value for joining should not find that removing them costs the developer almost nothing, and vice versa.</w:t>
       </w:r>
     </w:p>
     <w:p>
@@ -65,25 +65,25 @@
     <w:p>
       <w:pPr/>
       <w:r>
-        <w:t xml:space="preserve">First, we formalize the link. We define a contribution game, in which coalitions of contributors generate value by being included in training, and a deletion game, in which coalitions generate value by being removed. The latter is the dual of the former in the sense of cooperative game theory, and a classical property of the Shapley value implies that the two games assign every contributor the same value. We read this as a consistency result: Shapley-based pricing at the point of data acquisition and Shapley-based compensation at the point of deletion are the same rule.</w:t>
-      </w:r>
-    </w:p>
-    <w:p>
-      <w:pPr/>
-      <w:r>
-        <w:t xml:space="preserve">Second, we examine what happens when the counterfactual utilities in these games cannot be computed exactly. In practice, evaluating a model trained without a coalition requires either retraining, which is what we are trying to avoid, or applying an unlearning algorithm. We model the gap between the two as a residual-value function and show that, by linearity of the Shapley value, the estimated values equal the true values plus the Shapley value of the residual game. The total bias across all contributors equals minus the residual value at the empty coalition. Put plainly, if the developer's unlearning method leaves behind some general competence even after all contributors are nominally removed, the sum of estimated values will understate the true total by exactly that amount. Individual values can be biased in either direction.</w:t>
-      </w:r>
-    </w:p>
-    <w:p>
-      <w:pPr/>
-      <w:r>
-        <w:t xml:space="preserve">Third, we consider incentives. A developer who is liable for the value of data it retains, or who pays compensation tied to unlearning outcomes, has an obvious reason to under-unlearn and over-report. We set up a stylized audit model and derive a condition, linking audit probability, penalty, and the value of residual knowledge, under which truthful reporting is optimal.</w:t>
-      </w:r>
-    </w:p>
-    <w:p>
-      <w:pPr/>
-      <w:r>
-        <w:t xml:space="preserve">We complement the theory with an empirical design. Benchmarks built around fictitious authors make it possible to define contributors cleanly and to know, by construction, what a model trained without a given author should and should not know. We describe how to estimate both true and unlearning-based Shapley values on small models where exact retraining is still feasible, and how to measure the residual game directly. We report a first experiment with four contributor groups and a 0.5B-parameter model in which every coalition is retrained exactly. It bears on the results about residual bias and order dependence and, through a relearning attack, on audit power. It does not address redundant or heavily duplicated contributors, which we leave for future work.</w:t>
+        <w:t xml:space="preserve">First, we formalize the link. We define a contribution game, in which coalitions of contributors generate value by being included in training, and a deletion game, in which coalitions generate value by being removed. The latter is the dual of the former in the sense of cooperative game theory, and a classical property of the Shapley value implies that the two games assign every contributor the same value. We read this as a consistency result: Shapley-based pricing at acquisition and Shapley-based compensation at deletion are one and the same rule.</w:t>
+      </w:r>
+    </w:p>
+    <w:p>
+      <w:pPr/>
+      <w:r>
+        <w:t xml:space="preserve">Second, we examine what happens when the counterfactual utilities in these games cannot be computed exactly. In practice, evaluating a model trained without a coalition requires either retraining, which is what we are trying to avoid, or applying an unlearning algorithm. We model the gap between the two as a residual-value function and show, using the linearity of the Shapley value, that the estimated values equal the true values plus the Shapley value of the residual game. The total bias across all contributors equals minus the residual value at the empty coalition. Concretely, if the developer's unlearning method leaves some competence intact even after all contributors have nominally been removed, the sum of the estimated values understates the true total by exactly that amount. Biases in individual values can go in either direction.</w:t>
+      </w:r>
+    </w:p>
+    <w:p>
+      <w:pPr/>
+      <w:r>
+        <w:t xml:space="preserve">Third, we consider incentives. A developer who is liable for the value of the data it retains, or who pays compensation tied to unlearning outcomes, has an obvious reason to under-unlearn and over-report. We set up a stylized audit model and derive a condition, linking audit probability, penalty, and the value of residual knowledge, under which truthful reporting is optimal.</w:t>
+      </w:r>
+    </w:p>
+    <w:p>
+      <w:pPr/>
+      <w:r>
+        <w:t xml:space="preserve">We complement the theory with an empirical design. Benchmarks built around fictitious authors allow contributors to be defined cleanly and make it possible to know, by construction, what a model trained without a given author should and should not know. We describe how to estimate both true and unlearning-based Shapley values on small models, where exact retraining is still feasible, and how to measure the residual game directly. We then report a first experiment with four contributor groups and a 0.5B-parameter model in which every coalition is retrained exactly. It bears on the results about residual bias and order dependence and, through a relearning attack, on audit power. It does not address redundant or heavily duplicated contributors, which we leave for future work.</w:t>
       </w:r>
     </w:p>
     <w:p>
@@ -109,7 +109,7 @@
         <w:t xml:space="preserve">Data valuation.</w:t>
       </w:r>
       <w:r>
-        <w:t xml:space="preserve"> The use of the Shapley value (Shapley, 1953) to value training data was introduced by Ghorbani and Zou (2019) and, independently, by Jia et al. (2019), who also proposed efficient approximations for specific model classes. Subsequent work relaxed the efficiency axiom to obtain semivalues with better statistical properties, notably Beta Shapley (Kwon and Zou, 2022) and Data Banzhaf (Wang and Jia, 2023). Because exact Shapley computation requires retraining on exponentially many subsets, a separate line of work approximates marginal contributions with gradient-based influence estimates (Koh and Liang, 2017; Pruthi et al., 2020). Grosse et al. (2023) scaled influence functions to models with tens of billions of parameters. Our work treats these estimators as given and focuses on what happens when the counterfactual they rely on is generated by unlearning rather than retraining.</w:t>
+        <w:t xml:space="preserve"> The use of the Shapley value (Shapley, 1953) to value training data was introduced by Ghorbani and Zou (2019) and, independently, by Jia et al. (2019), who also proposed efficient approximations for specific model classes. Later work relaxed the efficiency axiom to obtain semivalues with better statistical properties, notably Beta Shapley (Kwon and Zou, 2022) and Data Banzhaf (Wang and Jia, 2023). Because exact Shapley computation requires retraining on exponentially many subsets, a separate line of work approximates marginal contributions with gradient-based influence estimates (Koh and Liang, 2017; Pruthi et al., 2020), and Grosse et al. (2023) scaled influence functions to models with tens of billions of parameters. We take these estimators as given and ask what happens when the counterfactual they rely on is generated by unlearning rather than by retraining.</w:t>
       </w:r>
     </w:p>
     <w:p>
@@ -121,7 +121,7 @@
         <w:t xml:space="preserve">Machine unlearning.</w:t>
       </w:r>
       <w:r>
-        <w:t xml:space="preserve"> Early formulations defined unlearning as producing a model indistinguishable from one retrained without the forget set (Cao and Yang, 2015; Ginart et al., 2019). Exact methods such as SISA (Bourtoule et al., 2021) achieve this by sharding training so that only a fraction of the model needs to be retrained. For large language models, most methods are approximate. Eldan and Russinovich (2023) proposed fine-tuning toward generic substitutes for memorized content; Zhang et al. (2024) introduced Negative Preference Optimization as a more stable alternative to gradient ascent. Evaluation has become a research area of its own, with benchmarks such as TOFU (Maini et al., 2024), WMDP (Li et al., 2024), and MUSE (Shi et al., 2024). Several studies report that unlearned knowledge can be recovered through light fine-tuning or adversarial prompting (Lynch et al., 2024; Łucki et al., 2024). We take this finding as a premise and ask how it propagates into valuation.</w:t>
+        <w:t xml:space="preserve"> Early formulations defined unlearning as producing a model indistinguishable from one retrained without the forget set (Cao and Yang, 2015; Ginart et al., 2019). Exact methods such as SISA (Bourtoule et al., 2021) achieve this by sharding the training process, so that only a fraction of the model must be retrained. For large language models, most methods are approximate: Eldan and Russinovich (2023) proposed fine-tuning toward generic substitutes for memorized content, and Zhang et al. (2024) introduced Negative Preference Optimization as a more stable alternative to gradient ascent. Evaluation has become a research area in its own right, with benchmarks such as TOFU (Maini et al., 2024), WMDP (Li et al., 2024), and MUSE (Shi et al., 2024). Several studies report that unlearned knowledge can be recovered through light fine-tuning or adversarial prompting (Lynch et al., 2024; Łucki et al., 2024). We take this finding as a premise and ask how it propagates into valuation.</w:t>
       </w:r>
     </w:p>
     <w:p>
@@ -133,7 +133,7 @@
         <w:t xml:space="preserve">Economics of data.</w:t>
       </w:r>
       <w:r>
-        <w:t xml:space="preserve"> Economists have studied data as a nonrival input (Jones and Tonetti, 2020), the externalities that arise when one person's data reveals information about others (Acemoglu et al., 2022), and the design of data marketplaces (Agarwal et al., 2019). The Shapley value has a long history in cost allocation and has been characterized axiomatically in several ways (Shapley, 1953; Young, 1985; Roth, 1988). To our knowledge, the duality between contribution and deletion games has not been used to connect data pricing with compensation for withdrawal, and the incentive problem created by unverifiable unlearning has not been modeled formally.</w:t>
+        <w:t xml:space="preserve"> Economists have studied data as a nonrival input (Jones and Tonetti, 2020), the externalities that arise when one person's data reveals information about others (Acemoglu et al., 2022), and the design of data marketplaces (Agarwal et al., 2019). The Shapley value has a long history in cost allocation and has been characterized axiomatically in several ways (Shapley, 1953; Young, 1985; Roth, 1988). To our knowledge, the duality between contribution and deletion games has not been used to connect data pricing with compensation for withdrawal, nor has the incentive problem created by unverifiable unlearning been modeled formally.</w:t>
       </w:r>
     </w:p>
     <w:p>
@@ -155,7 +155,7 @@
     <w:p>
       <w:pPr/>
       <w:r>
-        <w:t xml:space="preserve">Let N = {1, …, n} be a set of data contributors. Contributor i owns a dataset D_i. A developer trains a model on a base corpus D_0, which we treat as fixed and not subject to deletion, together with the data of some coalition S ⊆ N. Let U(S) denote the performance of the resulting model on a fixed evaluation suite. We work with the normalized function</w:t>
+        <w:t xml:space="preserve">Let N = {1, …, n} be a set of data contributors, where contributor i owns a dataset D_i. A developer trains a model on a base corpus D_0, which we treat as fixed and not subject to deletion, together with the data of some coalition S ⊆ N. Let U(S) denote the performance of the resulting model on a fixed evaluation suite. We work with the normalized function</w:t>
       </w:r>
     </w:p>
     <w:p>
@@ -187,13 +187,13 @@
     <w:p>
       <w:pPr/>
       <w:r>
-        <w:t xml:space="preserve">It is the unique allocation satisfying efficiency, symmetry, the null-player property, and additivity (Shapley, 1953). Efficiency means that the values sum to v(N), the total gain from all contributors' data.</w:t>
-      </w:r>
-    </w:p>
-    <w:p>
-      <w:pPr/>
-      <w:r>
-        <w:t xml:space="preserve">We treat contributors rather than individual examples as players for two reasons. Deletion requests in practice usually come from an identifiable party (an author, a publisher, a data subject) and concern all of their data at once. And grouping keeps n small enough that sampling-based estimation is conceivable even when each evaluation of v is expensive.</w:t>
+        <w:t xml:space="preserve">It is the unique allocation satisfying efficiency, symmetry, the null-player property, and additivity (Shapley, 1953); efficiency here means that the values sum to v(N), the total gain from all contributors' data.</w:t>
+      </w:r>
+    </w:p>
+    <w:p>
+      <w:pPr/>
+      <w:r>
+        <w:t xml:space="preserve">We treat contributors, rather than individual examples, as players for two reasons. First, deletion requests in practice usually come from an identifiable party (an author, a publisher, a data subject) and concern all of that party's data at once. Second, grouping keeps n small enough that sampling-based estimation remains conceivable even when each evaluation of v is expensive.</w:t>
       </w:r>
     </w:p>
     <w:p>
@@ -207,7 +207,7 @@
     <w:p>
       <w:pPr/>
       <w:r>
-        <w:t xml:space="preserve">Now suppose the model has been trained on all of N, and a coalition R ⊆ N asks to be removed. The value destroyed by the removal is</w:t>
+        <w:t xml:space="preserve">Now suppose the model has been trained on all of N and that a coalition R ⊆ N asks to be removed. The value destroyed by the removal is</w:t>
       </w:r>
     </w:p>
     <w:p>
@@ -229,7 +229,7 @@
     <w:p>
       <w:pPr/>
       <w:r>
-        <w:t xml:space="preserve">A natural question is how to divide the loss from a removal among the members of R, or more generally how to assign each contributor a "deletion value" that reflects their average importance in the deletion game. The Shapley value of w is the obvious candidate. The following result says that it introduces nothing new.</w:t>
+        <w:t xml:space="preserve">A natural question is how to divide the loss from a removal among the members of R or, more generally, how to assign each contributor a "deletion value" that reflects their average importance in the deletion game. The Shapley value of w is the obvious candidate, and the following result shows that it adds nothing new.</w:t>
       </w:r>
     </w:p>
     <w:p>
@@ -275,7 +275,7 @@
     <w:p>
       <w:pPr/>
       <w:r>
-        <w:t xml:space="preserve">The result is classical as a fact about games. Its interest here lies in the interpretation. A contributor's Shapley share of the value their data created, computed at the time of acquisition, equals their Shapley share of the value that would be destroyed by deletion. A compensation scheme that pays contributors their Shapley value for inclusion and a liability scheme that charges the developer their Shapley value upon withdrawal are therefore consistent with each other. Neither party can gain by relabeling a transaction as an acquisition or a deletion.</w:t>
+        <w:t xml:space="preserve">As a fact about games the result is classical; its interest here lies in the interpretation. A contributor's Shapley share of the value their data created, computed at acquisition, equals their Shapley share of the value that deletion would destroy. A scheme that pays contributors their Shapley value for inclusion and a liability scheme that charges the developer the same value upon withdrawal are therefore consistent with each other, and neither party can gain by relabeling a transaction as an acquisition or a deletion.</w:t>
       </w:r>
     </w:p>
     <w:p>
@@ -289,25 +289,25 @@
     <w:p>
       <w:pPr/>
       <w:r>
-        <w:t xml:space="preserve">The simplest alternative is to compensate contributor i by their leave-one-out loss, w({i}) = v(N) − v(N \ {i}). This is what one would naturally measure if one simply retrained, or unlearned, after a single deletion request. It has two well-known defects that become sharper in the deletion setting.</w:t>
-      </w:r>
-    </w:p>
-    <w:p>
-      <w:pPr/>
-      <w:r>
-        <w:t xml:space="preserve">The first is redundancy. Suppose contributors 1 and 2 hold near-identical data, so that v({1}) ≈ v({2}) ≈ v({1, 2}) = a. Each has leave-one-out loss close to zero, although jointly they are worth a. The Shapley value assigns each a/2. Language model training corpora are full of such near-duplicates (syndicated news, mirrored code, reposted text), so this case is not exotic.</w:t>
-      </w:r>
-    </w:p>
-    <w:p>
-      <w:pPr/>
-      <w:r>
-        <w:t xml:space="preserve">The second is order dependence. Suppose deletion requests arrive sequentially and each is priced by leave-one-out loss at the time it arrives. In the example above, whichever contributor leaves first is owed nothing, and the second is owed a. Total compensation depends on the order of requests, and contributors with substitutable data have an incentive to wait. Shapley values computed on the original game do not have this problem: they are fixed ex ante and sum to the same total regardless of the order in which contributors leave.</w:t>
-      </w:r>
-    </w:p>
-    <w:p>
-      <w:pPr/>
-      <w:r>
-        <w:t xml:space="preserve">We do not claim that Shapley values are the only reasonable rule. Semivalues such as Banzhaf drop efficiency and may be preferable for statistical reasons. Proposition 1 extends to any semivalue whose weights are symmetric under |S| ↦ n − 1 − |S|, which includes the Banzhaf value but not, in general, Beta Shapley.</w:t>
+        <w:t xml:space="preserve">The simplest alternative is to compensate contributor i by their leave-one-out loss, w({i}) = v(N) − v(N \ {i}). This is what one would naturally measure after retraining, or unlearning, in response to a single deletion request. It has two well-known defects, both of which are sharper in the deletion setting.</w:t>
+      </w:r>
+    </w:p>
+    <w:p>
+      <w:pPr/>
+      <w:r>
+        <w:t xml:space="preserve">The first is redundancy. Suppose contributors 1 and 2 hold near-identical data, so that v({1}) ≈ v({2}) ≈ v({1, 2}) = a. Each has a leave-one-out loss close to zero, although jointly they are worth a, whereas the Shapley value assigns each a/2. Language model training corpora contain many such near-duplicates (syndicated news, mirrored code, reposted text), so the case is far from exotic.</w:t>
+      </w:r>
+    </w:p>
+    <w:p>
+      <w:pPr/>
+      <w:r>
+        <w:t xml:space="preserve">The second is order dependence. Suppose deletion requests arrive sequentially and each is priced by leave-one-out loss at the time it arrives. In the example above, whichever contributor leaves first is owed nothing and the second is owed a. Total compensation then depends on the order of requests, and contributors with substitutable data have an incentive to wait. Shapley values computed on the original game avoid this problem: they are fixed ex ante and sum to the same total regardless of the order in which contributors leave.</w:t>
+      </w:r>
+    </w:p>
+    <w:p>
+      <w:pPr/>
+      <w:r>
+        <w:t xml:space="preserve">We do not claim that Shapley values are the only reasonable rule. Semivalues such as the Banzhaf value drop efficiency and may be preferable for statistical reasons. Proposition 1 extends to any semivalue whose weights are symmetric under |S| ↦ n − 1 − |S|, which includes the Banzhaf value but, in general, not Beta Shapley.</w:t>
       </w:r>
     </w:p>
     <w:p>
@@ -329,13 +329,13 @@
     <w:p>
       <w:pPr/>
       <w:r>
-        <w:t xml:space="preserve">Computing φ_i(v) requires evaluating v on many coalitions. For a large model, each evaluation would mean a full training run. Proposition 1 suggests a cheaper route. Because the deletion game has the same Shapley value, one can start from the model trained on all of N and estimate marginal contributions by removing contributors rather than adding them. A permutation-sampling estimator in the style of Ghorbani and Zou (2019) then walks along a random ordering of N, unlearning one contributor at a time and recording the drop in performance at each step. Each sampled permutation costs n unlearning operations instead of n training runs.</w:t>
-      </w:r>
-    </w:p>
-    <w:p>
-      <w:pPr/>
-      <w:r>
-        <w:t xml:space="preserve">The catch is that unlearning is approximate. Let A denote an unlearning algorithm and let Û(T) be the performance of the model obtained by applying A to remove N \ T from the fully trained model. We define the residual function</w:t>
+        <w:t xml:space="preserve">Computing φ_i(v) requires evaluating v on many coalitions, and for a large model each evaluation means a full training run. Proposition 1 suggests a cheaper route. Because the deletion game has the same Shapley value, one can start from the model trained on all of N and estimate marginal contributions by removing contributors rather than adding them. A permutation-sampling estimator in the style of Ghorbani and Zou (2019) then walks along a random ordering of N, unlearning one contributor at a time and recording the drop in performance at each step. Each sampled permutation costs n unlearning operations instead of n training runs.</w:t>
+      </w:r>
+    </w:p>
+    <w:p>
+      <w:pPr/>
+      <w:r>
+        <w:t xml:space="preserve">The catch is that unlearning is approximate. Let A denote an unlearning algorithm, and let Û(T) be the performance of the model obtained by applying A to remove N \ T from the fully trained model. We define the residual function</w:t>
       </w:r>
     </w:p>
     <w:p>
@@ -351,13 +351,13 @@
     <w:p>
       <w:pPr/>
       <w:r>
-        <w:t xml:space="preserve">where U(T) is the performance of a model actually retrained on D_0 together with the data of T. The residual captures everything that distinguishes approximate unlearning from retraining. It is useful to think of it as the difference of two non-negative parts, ε(T) = ρ(T) − κ(T). Here ρ(T) is residual knowledge, the performance that survives because the removed data was not fully forgotten, and κ(T) is collateral damage, the performance lost on unrelated capabilities as a side effect of the unlearning update.</w:t>
-      </w:r>
-    </w:p>
-    <w:p>
-      <w:pPr/>
-      <w:r>
-        <w:t xml:space="preserve">Throughout we assume that Û depends only on the coalition removed and not on the order in which removals were performed. This is a real restriction, since sequential unlearning can compound errors. We return to it in Section 7.</w:t>
+        <w:t xml:space="preserve">where U(T) is the performance of a model actually retrained on D_0 together with the data of T. The residual captures everything that distinguishes approximate unlearning from retraining. It is convenient to write it as a difference, ε(T) = ρ(T) − κ(T). Here ρ(T) is residual knowledge, the performance that survives because the removed data was not fully forgotten, and κ(T) is collateral damage, the performance lost on unrelated capabilities as a side effect of the unlearning update. Either term can be negative in practice, for example when unlearning pushes performance on the removed data below the retrained level.</w:t>
+      </w:r>
+    </w:p>
+    <w:p>
+      <w:pPr/>
+      <w:r>
+        <w:t xml:space="preserve">Throughout, we assume that Û depends only on the coalition removed and not on the order in which removals are performed. This is a real restriction, since sequential unlearning can compound errors, and we return to it in Section 7.</w:t>
       </w:r>
     </w:p>
     <w:p>
@@ -427,19 +427,19 @@
     <w:p>
       <w:pPr/>
       <w:r>
-        <w:t xml:space="preserve">The aggregate bias is governed by a single number, ε(∅), which compares a model from which every contributor has been unlearned with a model that never saw their data. If the unlearning method leaves residual knowledge behind and does little collateral damage, the estimated values understate the total contribution of the data. If it is destructive, they overstate it. In both cases the error is invisible from within the estimation procedure, because the procedure never observes the retrained counterfactual.</w:t>
-      </w:r>
-    </w:p>
-    <w:p>
-      <w:pPr/>
-      <w:r>
-        <w:t xml:space="preserve">The individual bias φ_i(ε) depends on how residuals vary across coalitions. Two simple cases are instructive. Suppose first that each removed contributor leaves behind a fixed residue r, so that ε(T) = r · |N \ T|. The residual game is then additive and φ_i(ε) = −r for every i: all values shift down by the same amount, and rankings are preserved. Suppose instead that residues are heterogeneous, ε(T) = Σ_{j ∉ T} r_j. Then φ_i(ε) = −r_i, and contributors whose data is hardest to forget are undervalued the most.</w:t>
-      </w:r>
-    </w:p>
-    <w:p>
-      <w:pPr/>
-      <w:r>
-        <w:t xml:space="preserve">This second case has an uncomfortable implication. Data is typically hard to unlearn because the model has absorbed it deeply, through repetition, duplication across the corpus, or because it underpins general skills. That is often the data that matters most. An estimation procedure built on approximate unlearning will therefore tend to understate the value of exactly the contributions that a fair compensation scheme most needs to price correctly.</w:t>
+        <w:t xml:space="preserve">The aggregate bias is governed by a single number, ε(∅), which compares a model from which every contributor has been unlearned with a model that never saw their data. If the unlearning method leaves residual knowledge behind and does little collateral damage, the estimated values understate the total contribution of the data; if it is destructive, they overstate it. Either way, the error is invisible from within the estimation procedure, because the procedure never observes the retrained counterfactual.</w:t>
+      </w:r>
+    </w:p>
+    <w:p>
+      <w:pPr/>
+      <w:r>
+        <w:t xml:space="preserve">The individual bias φ_i(ε) depends on how residuals vary across coalitions, and two simple cases are instructive. Suppose first that each removed contributor leaves behind a fixed residue r, so that ε(T) = r · |N \ T|. The residual game is then additive and φ_i(ε) = −r for every i: all values shift down by the same amount, and rankings are preserved. Suppose instead that residues are heterogeneous, ε(T) = Σ_{j ∉ T} r_j. Then φ_i(ε) = −r_i, and the contributors whose data is hardest to forget are undervalued the most.</w:t>
+      </w:r>
+    </w:p>
+    <w:p>
+      <w:pPr/>
+      <w:r>
+        <w:t xml:space="preserve">The second case has an uncomfortable implication. Data is typically hard to unlearn because the model has absorbed it deeply, whether through repetition, duplication across the corpus, or because it underpins general skills, and such data is often what matters most. An estimation procedure built on approximate unlearning will therefore tend to understate the value of exactly those contributions that a fair compensation scheme most needs to price correctly.</w:t>
       </w:r>
     </w:p>
     <w:p>
@@ -453,7 +453,7 @@
     <w:p>
       <w:pPr/>
       <w:r>
-        <w:t xml:space="preserve">Proposition 2 also suggests a practical check. The aggregate bias does not require computing any Shapley values; it requires only one comparison between a fully unlearned model and a base model trained on D_0 alone. Developers often retain such base checkpoints. Where they do not, the comparison can be run on a smaller proxy model, which is the approach we take in Section 6. A large estimated ε(∅) is a warning that unlearning-based valuations should not be used for compensation without correction. A small or negative ε(∅) is not reassuring, however, since it can coexist with substantial knowledge that a relearning attack recovers (Section 6.4).</w:t>
+        <w:t xml:space="preserve">Proposition 2 also suggests a practical check. The aggregate bias does not require computing any Shapley values; it needs only a single comparison between a fully unlearned model and a base model trained on D_0 alone. Developers often retain such base checkpoints, and where they do not, the comparison can be run on a smaller proxy model, which is the approach we take in Section 6. A large estimated ε(∅) is a warning that unlearning-based valuations should not be used for compensation without correction. A small or negative ε(∅) is not reassuring, however, since it can coexist with substantial knowledge that a relearning attack recovers (Section 6.4).</w:t>
       </w:r>
     </w:p>
     <w:p>
@@ -475,13 +475,13 @@
     <w:p>
       <w:pPr/>
       <w:r>
-        <w:t xml:space="preserve">The analysis so far assumes that whoever computes the values has no stake in the outcome. In practice the developer both performs the unlearning and is best placed to measure its effects, while a regulator or court can only verify compliance imperfectly. We study the resulting incentive problem in a deliberately simple setting.</w:t>
-      </w:r>
-    </w:p>
-    <w:p>
-      <w:pPr/>
-      <w:r>
-        <w:t xml:space="preserve">Contributor i requests deletion. The developer can either remove the data exactly, at cost C (by retraining, or by retraining the affected shard if the model was trained with a sharded scheme), or apply an approximate method at cost c &lt; C. Exact removal leaves no residual. Approximate removal leaves residual value ρ_i &gt; 0, from which the developer earns βρ_i, where β ≥ 0 converts model performance into revenue. In either case the developer reports that the data has been removed.</w:t>
+        <w:t xml:space="preserve">The analysis so far assumes that whoever computes the values has no stake in the outcome. In practice the developer both performs the unlearning and is best placed to measure its effects, while a regulator or court can verify compliance only imperfectly. We study the resulting incentive problem in a deliberately simple setting.</w:t>
+      </w:r>
+    </w:p>
+    <w:p>
+      <w:pPr/>
+      <w:r>
+        <w:t xml:space="preserve">Contributor i requests deletion. The developer can either remove the data exactly, at cost C (by retraining, or by retraining only the affected shard if the model was trained with a sharded scheme), or apply an approximate method at cost c &lt; C. Exact removal leaves no residual. Approximate removal leaves residual value ρ_i &gt; 0, from which the developer earns βρ_i, where β ≥ 0 converts model performance into revenue. In either case the developer reports that the data has been removed.</w:t>
       </w:r>
     </w:p>
     <w:p>
@@ -527,25 +527,25 @@
     <w:p>
       <w:pPr/>
       <w:r>
-        <w:t xml:space="preserve">The condition is elementary, but three features of it are worth drawing out.</w:t>
-      </w:r>
-    </w:p>
-    <w:p>
-      <w:pPr/>
-      <w:r>
-        <w:t xml:space="preserve">First, audit power enters symmetrically with audit frequency. A regime that audits often but relies on weak tests is no better than one that audits rarely with strong ones. This gives an economic reason to care about the robustness of unlearning evaluation. The finding that "forgotten" knowledge can be recovered by light fine-tuning (Lynch et al., 2024; Łucki et al., 2024) is, in this model, good news for enforcement: it raises δ.</w:t>
-      </w:r>
-    </w:p>
-    <w:p>
-      <w:pPr/>
-      <w:r>
-        <w:t xml:space="preserve">Second, the penalty base should not be computed by the developer. A natural proposal is to set F_i proportional to the contributor's value, F_i = kφ_i. But if φ_i is estimated by the developer using its own approximate unlearning method, Proposition 2 implies that the estimate is biased downward whenever residual knowledge dominates collateral damage, and biased most for the contributors with the largest residue. The developer then benefits twice from incomplete unlearning: once through βρ_i and again through a smaller penalty base. Valuations used for enforcement should come from a third party, or at least from retraining-based estimates on a proxy model.</w:t>
-      </w:r>
-    </w:p>
-    <w:p>
-      <w:pPr/>
-      <w:r>
-        <w:t xml:space="preserve">Third, the term C − c depends on decisions made at training time. Training with a sharded or otherwise modular scheme lowers the cost of exact removal and so relaxes the condition. This is an ex ante investment in "unlearnability" whose return depends on how deletion requests will later be enforced. Without credible enforcement, developers have little reason to make it.</w:t>
+        <w:t xml:space="preserve">The condition is elementary, but three of its features deserve comment.</w:t>
+      </w:r>
+    </w:p>
+    <w:p>
+      <w:pPr/>
+      <w:r>
+        <w:t xml:space="preserve">First, audit power enters on a par with audit frequency: a regime that audits often but relies on weak tests is no better than one that audits rarely with strong ones. This gives an economic reason to care about the robustness of unlearning evaluation. The finding that "forgotten" knowledge can be recovered by light fine-tuning (Lynch et al., 2024; Łucki et al., 2024) is, in this model, good news for enforcement, because it raises δ.</w:t>
+      </w:r>
+    </w:p>
+    <w:p>
+      <w:pPr/>
+      <w:r>
+        <w:t xml:space="preserve">Second, the penalty base should not be computed by the developer. A natural proposal is to set F_i proportional to the contributor's value, F_i = kφ_i. But if φ_i is estimated by the developer using its own approximate unlearning method, Proposition 2 implies that the estimate is biased downward whenever residual knowledge dominates collateral damage, and biased most for the contributors with the largest residue. The developer then benefits twice from incomplete unlearning: once through βρ_i and again through a smaller penalty base. Valuations used for enforcement should therefore come from a third party, or at least from retraining-based estimates on a proxy model.</w:t>
+      </w:r>
+    </w:p>
+    <w:p>
+      <w:pPr/>
+      <w:r>
+        <w:t xml:space="preserve">Third, the term C − c depends on decisions made at training time. Training with a sharded or otherwise modular scheme lowers the cost of exact removal and so relaxes the condition. This amounts to an ex ante investment in "unlearnability" whose return depends on how deletion requests will later be enforced; without credible enforcement, developers have little reason to make it.</w:t>
       </w:r>
     </w:p>
     <w:p>
@@ -559,13 +559,13 @@
     <w:p>
       <w:pPr/>
       <w:r>
-        <w:t xml:space="preserve">The discussion above takes for granted that a deletion request must be honored. Following Calabresi and Melamed (1972), one could instead protect contributors with a liability rule: the developer may keep the data, provided it pays damages. Proposition 1 suggests a natural measure of damages, namely φ_i, which is consistent with what the contributor would have been paid at acquisition.</w:t>
-      </w:r>
-    </w:p>
-    <w:p>
-      <w:pPr/>
-      <w:r>
-        <w:t xml:space="preserve">Under such a rule the developer retains i's data if and only if the cost of losing it exceeds the damages, that is, if w({i}) + C ≥ φ_i, where w({i}) is the leave-one-out loss. Two consequences follow. When i's data is largely redundant, w({i}) is small relative to φ_i and the developer will tend to remove it rather than pay; little social value is lost, since others supply the same information. When i's data is complementary to the rest, w({i}) can exceed φ_i and the developer keeps it and pays. In both cases the outcome tracks the actual marginal importance of the data. The rule is unattractive, however, when the contributor's interest is not economic, as with personal data or safety-critical knowledge. There a property rule, backed by the audit condition above, seems more appropriate.</w:t>
+        <w:t xml:space="preserve">The discussion above takes for granted that a deletion request must be honored. Following Calabresi and Melamed (1972), one could instead protect contributors with a liability rule, under which the developer may keep the data provided it pays damages. Proposition 1 suggests a natural measure of damages, namely φ_i, which is consistent with what the contributor would have been paid at acquisition.</w:t>
+      </w:r>
+    </w:p>
+    <w:p>
+      <w:pPr/>
+      <w:r>
+        <w:t xml:space="preserve">Under such a rule the developer retains i's data if and only if the cost of losing it exceeds the damages, that is, if w({i}) + C ≥ φ_i, where w({i}) is the leave-one-out loss. Two consequences follow. When i's data is largely redundant, w({i}) is small relative to φ_i, and the developer will tend to remove the data rather than pay; little social value is lost, since others supply the same information. When i's data is complementary to the rest, w({i}) can exceed φ_i, and the developer keeps the data and pays. In both cases the outcome tracks the actual marginal importance of the data. The rule is unattractive, however, when the contributor's interest is not economic, as with personal data or safety-critical knowledge, and there a property rule backed by the audit condition above seems more appropriate.</w:t>
       </w:r>
     </w:p>
     <w:p>
@@ -1557,7 +1557,7 @@
     <w:p>
       <w:pPr/>
       <w:r>
-        <w:t xml:space="preserve">Data valuation and machine unlearning look at the same counterfactual from opposite directions. We have shown that, under the Shapley value, the two directions agree exactly, which gives a consistent basis for pricing data when it is acquired and compensating contributors when it is withdrawn. The agreement breaks down in practice because the counterfactuals must be generated by approximate unlearning. The resulting bias has a simple structure: it is additive, its total is fixed by the residual performance of a fully unlearned model, and it falls hardest on the data that is most difficult to forget. Because the developer controls both the unlearning and its measurement, these biases also create incentives to under-unlearn, which can be countered only by audits that are both frequent and powerful. In a small experiment, the aggregate bias changed sign with unlearning strength, order dependence grew with it, and a brief relearning attack recovered knowledge that the aggregate diagnostic had classed as removed. We hope the framework helps connect technical work on unlearning evaluation with the policy questions that motivate it.</w:t>
+        <w:t xml:space="preserve">Data valuation and machine unlearning look at the same counterfactual from opposite directions. We have shown that, under the Shapley value, the two directions agree exactly, which gives a consistent basis for pricing data when it is acquired and compensating contributors when it is withdrawn. In practice the agreement breaks down, because the counterfactuals must be generated by approximate unlearning. The resulting bias has a simple structure: it is additive, its total is fixed by the residual performance of a fully unlearned model, and, according to the theory, it falls hardest on the data that is most difficult to forget, a prediction we have not yet tested. In a small experiment, the aggregate bias changed sign with unlearning strength, order dependence grew with it, and a brief relearning attack recovered knowledge that the aggregate diagnostic had classed as removed. Because the developer controls both the unlearning and its measurement, these biases also create incentives to under-unlearn, which can be countered only by audits that are both frequent and powerful. We hope the framework helps connect technical work on unlearning evaluation with the policy questions that motivate it.</w:t>
       </w:r>
     </w:p>
     <w:p>

</xml_diff>